<commit_message>
added name and T-number
</commit_message>
<xml_diff>
--- a/Questions for coding project.docx
+++ b/Questions for coding project.docx
@@ -4,15 +4,23 @@
   <w:body>
     <w:p>
       <w:r>
+        <w:t>Cameron Jasper</w:t>
+      </w:r>
+    </w:p>
+    <w:p>
+      <w:r>
+        <w:t>T00340013</w:t>
+      </w:r>
+    </w:p>
+    <w:p/>
+    <w:p>
+      <w:r>
         <w:t>Courses:</w:t>
       </w:r>
     </w:p>
     <w:p>
       <w:r>
-        <w:t>FIN-3210</w:t>
-      </w:r>
-      <w:r>
-        <w:t>-004</w:t>
+        <w:t>FIN-3210-004</w:t>
       </w:r>
     </w:p>
     <w:p>
@@ -316,6 +324,7 @@
         </w:numPr>
       </w:pPr>
       <w:r>
+        <w:lastRenderedPageBreak/>
         <w:t>Any amount</w:t>
       </w:r>
     </w:p>
@@ -376,192 +385,539 @@
         </w:numPr>
       </w:pPr>
       <w:r>
+        <w:t>New present value</w:t>
+      </w:r>
+    </w:p>
+    <w:p>
+      <w:pPr>
+        <w:pStyle w:val="ListParagraph"/>
+        <w:numPr>
+          <w:ilvl w:val="1"/>
+          <w:numId w:val="1"/>
+        </w:numPr>
+      </w:pPr>
+      <w:r>
+        <w:t xml:space="preserve">Net percent </w:t>
+      </w:r>
+      <w:r>
+        <w:t>value</w:t>
+      </w:r>
+    </w:p>
+    <w:p>
+      <w:pPr>
+        <w:pStyle w:val="ListParagraph"/>
+        <w:numPr>
+          <w:ilvl w:val="1"/>
+          <w:numId w:val="1"/>
+        </w:numPr>
+      </w:pPr>
+      <w:r>
+        <w:t>Net present value</w:t>
+      </w:r>
+    </w:p>
+    <w:p>
+      <w:pPr>
+        <w:pStyle w:val="ListParagraph"/>
+        <w:numPr>
+          <w:ilvl w:val="1"/>
+          <w:numId w:val="1"/>
+        </w:numPr>
+      </w:pPr>
+      <w:proofErr w:type="spellStart"/>
+      <w:r>
+        <w:t>Newguard</w:t>
+      </w:r>
+      <w:proofErr w:type="spellEnd"/>
+      <w:r>
+        <w:t xml:space="preserve"> percentile variable</w:t>
+      </w:r>
+    </w:p>
+    <w:p>
+      <w:pPr>
+        <w:pStyle w:val="ListParagraph"/>
+        <w:numPr>
+          <w:ilvl w:val="0"/>
+          <w:numId w:val="1"/>
+        </w:numPr>
+      </w:pPr>
+      <w:r>
+        <w:t>Who controls the creation of money in the US</w:t>
+      </w:r>
+    </w:p>
+    <w:p>
+      <w:pPr>
+        <w:pStyle w:val="ListParagraph"/>
+        <w:numPr>
+          <w:ilvl w:val="1"/>
+          <w:numId w:val="1"/>
+        </w:numPr>
+      </w:pPr>
+      <w:r>
+        <w:t>The Federal Government</w:t>
+      </w:r>
+    </w:p>
+    <w:p>
+      <w:pPr>
+        <w:pStyle w:val="ListParagraph"/>
+        <w:numPr>
+          <w:ilvl w:val="1"/>
+          <w:numId w:val="1"/>
+        </w:numPr>
+      </w:pPr>
+      <w:r>
+        <w:t>The Courts</w:t>
+      </w:r>
+    </w:p>
+    <w:p>
+      <w:pPr>
+        <w:pStyle w:val="ListParagraph"/>
+        <w:numPr>
+          <w:ilvl w:val="1"/>
+          <w:numId w:val="1"/>
+        </w:numPr>
+      </w:pPr>
+      <w:r>
+        <w:t>Congress</w:t>
+      </w:r>
+    </w:p>
+    <w:p>
+      <w:pPr>
+        <w:pStyle w:val="ListParagraph"/>
+        <w:numPr>
+          <w:ilvl w:val="1"/>
+          <w:numId w:val="1"/>
+        </w:numPr>
+      </w:pPr>
+      <w:r>
+        <w:t>The Federal Reserve</w:t>
+      </w:r>
+    </w:p>
+    <w:p>
+      <w:pPr>
+        <w:pStyle w:val="ListParagraph"/>
+        <w:numPr>
+          <w:ilvl w:val="0"/>
+          <w:numId w:val="1"/>
+        </w:numPr>
+      </w:pPr>
+      <w:r>
+        <w:t xml:space="preserve">What drives the Stock Market </w:t>
+      </w:r>
+    </w:p>
+    <w:p>
+      <w:pPr>
+        <w:pStyle w:val="ListParagraph"/>
+        <w:numPr>
+          <w:ilvl w:val="1"/>
+          <w:numId w:val="1"/>
+        </w:numPr>
+      </w:pPr>
+      <w:r>
+        <w:t>Investors</w:t>
+      </w:r>
+    </w:p>
+    <w:p>
+      <w:pPr>
+        <w:pStyle w:val="ListParagraph"/>
+        <w:numPr>
+          <w:ilvl w:val="1"/>
+          <w:numId w:val="1"/>
+        </w:numPr>
+      </w:pPr>
+      <w:r>
+        <w:t>Buyers</w:t>
+      </w:r>
+    </w:p>
+    <w:p>
+      <w:pPr>
+        <w:pStyle w:val="ListParagraph"/>
+        <w:numPr>
+          <w:ilvl w:val="1"/>
+          <w:numId w:val="1"/>
+        </w:numPr>
+      </w:pPr>
+      <w:r>
+        <w:t>The Government</w:t>
+      </w:r>
+    </w:p>
+    <w:p>
+      <w:pPr>
+        <w:pStyle w:val="ListParagraph"/>
+        <w:numPr>
+          <w:ilvl w:val="1"/>
+          <w:numId w:val="1"/>
+        </w:numPr>
+      </w:pPr>
+      <w:r>
+        <w:t>The Bond Market</w:t>
+      </w:r>
+    </w:p>
+    <w:p>
+      <w:pPr>
+        <w:pStyle w:val="ListParagraph"/>
+        <w:numPr>
+          <w:ilvl w:val="0"/>
+          <w:numId w:val="1"/>
+        </w:numPr>
+      </w:pPr>
+      <w:r>
+        <w:t>Investors like return NOT risk</w:t>
+      </w:r>
+    </w:p>
+    <w:p>
+      <w:pPr>
+        <w:pStyle w:val="ListParagraph"/>
+        <w:numPr>
+          <w:ilvl w:val="1"/>
+          <w:numId w:val="1"/>
+        </w:numPr>
+      </w:pPr>
+      <w:r>
+        <w:t>True</w:t>
+      </w:r>
+    </w:p>
+    <w:p>
+      <w:pPr>
+        <w:pStyle w:val="ListParagraph"/>
+        <w:numPr>
+          <w:ilvl w:val="1"/>
+          <w:numId w:val="1"/>
+        </w:numPr>
+      </w:pPr>
+      <w:r>
+        <w:t>False</w:t>
+      </w:r>
+    </w:p>
+    <w:p>
+      <w:r>
+        <w:t>Answer key for FIN-3210</w:t>
+      </w:r>
+    </w:p>
+    <w:p>
+      <w:pPr>
+        <w:pStyle w:val="ListParagraph"/>
+        <w:numPr>
+          <w:ilvl w:val="0"/>
+          <w:numId w:val="2"/>
+        </w:numPr>
+      </w:pPr>
+      <w:r>
+        <w:t>A</w:t>
+      </w:r>
+    </w:p>
+    <w:p>
+      <w:pPr>
+        <w:pStyle w:val="ListParagraph"/>
+        <w:numPr>
+          <w:ilvl w:val="0"/>
+          <w:numId w:val="2"/>
+        </w:numPr>
+      </w:pPr>
+      <w:r>
+        <w:t>C</w:t>
+      </w:r>
+    </w:p>
+    <w:p>
+      <w:pPr>
+        <w:pStyle w:val="ListParagraph"/>
+        <w:numPr>
+          <w:ilvl w:val="0"/>
+          <w:numId w:val="2"/>
+        </w:numPr>
+      </w:pPr>
+      <w:r>
+        <w:t>D</w:t>
+      </w:r>
+    </w:p>
+    <w:p>
+      <w:pPr>
+        <w:pStyle w:val="ListParagraph"/>
+        <w:numPr>
+          <w:ilvl w:val="0"/>
+          <w:numId w:val="2"/>
+        </w:numPr>
+      </w:pPr>
+      <w:r>
+        <w:t>A</w:t>
+      </w:r>
+    </w:p>
+    <w:p>
+      <w:pPr>
+        <w:pStyle w:val="ListParagraph"/>
+        <w:numPr>
+          <w:ilvl w:val="0"/>
+          <w:numId w:val="2"/>
+        </w:numPr>
+      </w:pPr>
+      <w:r>
+        <w:t>A</w:t>
+      </w:r>
+    </w:p>
+    <w:p>
+      <w:pPr>
+        <w:pStyle w:val="ListParagraph"/>
+        <w:numPr>
+          <w:ilvl w:val="0"/>
+          <w:numId w:val="2"/>
+        </w:numPr>
+      </w:pPr>
+      <w:r>
+        <w:t>A</w:t>
+      </w:r>
+    </w:p>
+    <w:p>
+      <w:pPr>
+        <w:pStyle w:val="ListParagraph"/>
+        <w:numPr>
+          <w:ilvl w:val="0"/>
+          <w:numId w:val="2"/>
+        </w:numPr>
+      </w:pPr>
+      <w:r>
+        <w:t>C</w:t>
+      </w:r>
+    </w:p>
+    <w:p>
+      <w:pPr>
+        <w:pStyle w:val="ListParagraph"/>
+        <w:numPr>
+          <w:ilvl w:val="0"/>
+          <w:numId w:val="2"/>
+        </w:numPr>
+      </w:pPr>
+      <w:r>
+        <w:t>D</w:t>
+      </w:r>
+    </w:p>
+    <w:p>
+      <w:pPr>
+        <w:pStyle w:val="ListParagraph"/>
+        <w:numPr>
+          <w:ilvl w:val="0"/>
+          <w:numId w:val="2"/>
+        </w:numPr>
+      </w:pPr>
+      <w:r>
+        <w:t>D</w:t>
+      </w:r>
+    </w:p>
+    <w:p>
+      <w:pPr>
+        <w:pStyle w:val="ListParagraph"/>
+        <w:numPr>
+          <w:ilvl w:val="0"/>
+          <w:numId w:val="2"/>
+        </w:numPr>
+      </w:pPr>
+      <w:r>
+        <w:t>A</w:t>
+      </w:r>
+    </w:p>
+    <w:p/>
+    <w:p>
+      <w:r>
+        <w:t>DS-3620</w:t>
+      </w:r>
+    </w:p>
+    <w:p>
+      <w:pPr>
+        <w:pStyle w:val="ListParagraph"/>
+        <w:numPr>
+          <w:ilvl w:val="0"/>
+          <w:numId w:val="4"/>
+        </w:numPr>
+      </w:pPr>
+      <w:r>
+        <w:t>What is difficult, if not impossible, to obtain</w:t>
+      </w:r>
+    </w:p>
+    <w:p>
+      <w:pPr>
+        <w:pStyle w:val="ListParagraph"/>
+        <w:numPr>
+          <w:ilvl w:val="1"/>
+          <w:numId w:val="4"/>
+        </w:numPr>
+      </w:pPr>
+      <w:r>
+        <w:t>Sample data</w:t>
+      </w:r>
+    </w:p>
+    <w:p>
+      <w:pPr>
+        <w:pStyle w:val="ListParagraph"/>
+        <w:numPr>
+          <w:ilvl w:val="1"/>
+          <w:numId w:val="4"/>
+        </w:numPr>
+      </w:pPr>
+      <w:r>
+        <w:t>Population data</w:t>
+      </w:r>
+    </w:p>
+    <w:p>
+      <w:pPr>
+        <w:pStyle w:val="ListParagraph"/>
+        <w:numPr>
+          <w:ilvl w:val="1"/>
+          <w:numId w:val="4"/>
+        </w:numPr>
+      </w:pPr>
+      <w:r>
+        <w:t>Big data</w:t>
+      </w:r>
+    </w:p>
+    <w:p>
+      <w:pPr>
+        <w:pStyle w:val="ListParagraph"/>
+        <w:numPr>
+          <w:ilvl w:val="1"/>
+          <w:numId w:val="4"/>
+        </w:numPr>
+      </w:pPr>
+      <w:r>
+        <w:t>Meta data</w:t>
+      </w:r>
+    </w:p>
+    <w:p>
+      <w:pPr>
+        <w:pStyle w:val="ListParagraph"/>
+        <w:numPr>
+          <w:ilvl w:val="0"/>
+          <w:numId w:val="4"/>
+        </w:numPr>
+      </w:pPr>
+      <w:r>
+        <w:t>What is time series data</w:t>
+      </w:r>
+    </w:p>
+    <w:p>
+      <w:pPr>
+        <w:pStyle w:val="ListParagraph"/>
+        <w:numPr>
+          <w:ilvl w:val="1"/>
+          <w:numId w:val="4"/>
+        </w:numPr>
+      </w:pPr>
+      <w:r>
+        <w:t>Records info in equal time periods</w:t>
+      </w:r>
+    </w:p>
+    <w:p>
+      <w:pPr>
+        <w:pStyle w:val="ListParagraph"/>
+        <w:numPr>
+          <w:ilvl w:val="1"/>
+          <w:numId w:val="4"/>
+        </w:numPr>
+      </w:pPr>
+      <w:r>
         <w:lastRenderedPageBreak/>
-        <w:t>New present value</w:t>
-      </w:r>
-    </w:p>
-    <w:p>
-      <w:pPr>
-        <w:pStyle w:val="ListParagraph"/>
-        <w:numPr>
-          <w:ilvl w:val="1"/>
-          <w:numId w:val="1"/>
-        </w:numPr>
-      </w:pPr>
-      <w:r>
-        <w:t xml:space="preserve">Net percent </w:t>
-      </w:r>
-      <w:r>
-        <w:t>value</w:t>
-      </w:r>
-    </w:p>
-    <w:p>
-      <w:pPr>
-        <w:pStyle w:val="ListParagraph"/>
-        <w:numPr>
-          <w:ilvl w:val="1"/>
-          <w:numId w:val="1"/>
-        </w:numPr>
-      </w:pPr>
-      <w:r>
-        <w:t>Net present value</w:t>
-      </w:r>
-    </w:p>
-    <w:p>
-      <w:pPr>
-        <w:pStyle w:val="ListParagraph"/>
-        <w:numPr>
-          <w:ilvl w:val="1"/>
-          <w:numId w:val="1"/>
-        </w:numPr>
-      </w:pPr>
-      <w:proofErr w:type="spellStart"/>
-      <w:r>
-        <w:t>Newguard</w:t>
-      </w:r>
-      <w:proofErr w:type="spellEnd"/>
-      <w:r>
-        <w:t xml:space="preserve"> percentile variable</w:t>
-      </w:r>
-    </w:p>
-    <w:p>
-      <w:pPr>
-        <w:pStyle w:val="ListParagraph"/>
-        <w:numPr>
-          <w:ilvl w:val="0"/>
-          <w:numId w:val="1"/>
-        </w:numPr>
-      </w:pPr>
-      <w:r>
-        <w:t>Who controls the creation of money in the US</w:t>
-      </w:r>
-    </w:p>
-    <w:p>
-      <w:pPr>
-        <w:pStyle w:val="ListParagraph"/>
-        <w:numPr>
-          <w:ilvl w:val="1"/>
-          <w:numId w:val="1"/>
-        </w:numPr>
-      </w:pPr>
-      <w:r>
-        <w:t>The Federal Government</w:t>
-      </w:r>
-    </w:p>
-    <w:p>
-      <w:pPr>
-        <w:pStyle w:val="ListParagraph"/>
-        <w:numPr>
-          <w:ilvl w:val="1"/>
-          <w:numId w:val="1"/>
-        </w:numPr>
-      </w:pPr>
-      <w:r>
-        <w:t>The Courts</w:t>
-      </w:r>
-    </w:p>
-    <w:p>
-      <w:pPr>
-        <w:pStyle w:val="ListParagraph"/>
-        <w:numPr>
-          <w:ilvl w:val="1"/>
-          <w:numId w:val="1"/>
-        </w:numPr>
-      </w:pPr>
-      <w:r>
-        <w:t>Congress</w:t>
-      </w:r>
-    </w:p>
-    <w:p>
-      <w:pPr>
-        <w:pStyle w:val="ListParagraph"/>
-        <w:numPr>
-          <w:ilvl w:val="1"/>
-          <w:numId w:val="1"/>
-        </w:numPr>
-      </w:pPr>
-      <w:r>
-        <w:t>The Federal Reserve</w:t>
-      </w:r>
-    </w:p>
-    <w:p>
-      <w:pPr>
-        <w:pStyle w:val="ListParagraph"/>
-        <w:numPr>
-          <w:ilvl w:val="0"/>
-          <w:numId w:val="1"/>
-        </w:numPr>
-      </w:pPr>
-      <w:r>
-        <w:t xml:space="preserve">What drives the Stock Market </w:t>
-      </w:r>
-    </w:p>
-    <w:p>
-      <w:pPr>
-        <w:pStyle w:val="ListParagraph"/>
-        <w:numPr>
-          <w:ilvl w:val="1"/>
-          <w:numId w:val="1"/>
-        </w:numPr>
-      </w:pPr>
-      <w:r>
-        <w:t>Investors</w:t>
-      </w:r>
-    </w:p>
-    <w:p>
-      <w:pPr>
-        <w:pStyle w:val="ListParagraph"/>
-        <w:numPr>
-          <w:ilvl w:val="1"/>
-          <w:numId w:val="1"/>
-        </w:numPr>
-      </w:pPr>
-      <w:r>
-        <w:t>Buyers</w:t>
-      </w:r>
-    </w:p>
-    <w:p>
-      <w:pPr>
-        <w:pStyle w:val="ListParagraph"/>
-        <w:numPr>
-          <w:ilvl w:val="1"/>
-          <w:numId w:val="1"/>
-        </w:numPr>
-      </w:pPr>
-      <w:r>
-        <w:t>The Government</w:t>
-      </w:r>
-    </w:p>
-    <w:p>
-      <w:pPr>
-        <w:pStyle w:val="ListParagraph"/>
-        <w:numPr>
-          <w:ilvl w:val="1"/>
-          <w:numId w:val="1"/>
-        </w:numPr>
-      </w:pPr>
-      <w:r>
-        <w:t>The Bond Market</w:t>
-      </w:r>
-    </w:p>
-    <w:p>
-      <w:pPr>
-        <w:pStyle w:val="ListParagraph"/>
-        <w:numPr>
-          <w:ilvl w:val="0"/>
-          <w:numId w:val="1"/>
-        </w:numPr>
-      </w:pPr>
-      <w:r>
-        <w:t>Investors like return NOT risk</w:t>
-      </w:r>
-    </w:p>
-    <w:p>
-      <w:pPr>
-        <w:pStyle w:val="ListParagraph"/>
-        <w:numPr>
-          <w:ilvl w:val="1"/>
-          <w:numId w:val="1"/>
+        <w:t>Records info over time</w:t>
+      </w:r>
+    </w:p>
+    <w:p>
+      <w:pPr>
+        <w:pStyle w:val="ListParagraph"/>
+        <w:numPr>
+          <w:ilvl w:val="1"/>
+          <w:numId w:val="4"/>
+        </w:numPr>
+      </w:pPr>
+      <w:r>
+        <w:t>Records info from the past times</w:t>
+      </w:r>
+    </w:p>
+    <w:p>
+      <w:pPr>
+        <w:pStyle w:val="ListParagraph"/>
+        <w:numPr>
+          <w:ilvl w:val="1"/>
+          <w:numId w:val="4"/>
+        </w:numPr>
+      </w:pPr>
+      <w:r>
+        <w:t>Records info far into the future</w:t>
+      </w:r>
+    </w:p>
+    <w:p>
+      <w:pPr>
+        <w:pStyle w:val="ListParagraph"/>
+        <w:numPr>
+          <w:ilvl w:val="0"/>
+          <w:numId w:val="4"/>
+        </w:numPr>
+      </w:pPr>
+      <w:r>
+        <w:t>What is mode</w:t>
+      </w:r>
+    </w:p>
+    <w:p>
+      <w:pPr>
+        <w:pStyle w:val="ListParagraph"/>
+        <w:numPr>
+          <w:ilvl w:val="1"/>
+          <w:numId w:val="4"/>
+        </w:numPr>
+      </w:pPr>
+      <w:r>
+        <w:t>The center of data</w:t>
+      </w:r>
+    </w:p>
+    <w:p>
+      <w:pPr>
+        <w:pStyle w:val="ListParagraph"/>
+        <w:numPr>
+          <w:ilvl w:val="1"/>
+          <w:numId w:val="4"/>
+        </w:numPr>
+      </w:pPr>
+      <w:r>
+        <w:t>The average of data</w:t>
+      </w:r>
+    </w:p>
+    <w:p>
+      <w:pPr>
+        <w:pStyle w:val="ListParagraph"/>
+        <w:numPr>
+          <w:ilvl w:val="1"/>
+          <w:numId w:val="4"/>
+        </w:numPr>
+      </w:pPr>
+      <w:r>
+        <w:t xml:space="preserve">The number that occurs the most frequently </w:t>
+      </w:r>
+    </w:p>
+    <w:p>
+      <w:pPr>
+        <w:pStyle w:val="ListParagraph"/>
+        <w:numPr>
+          <w:ilvl w:val="1"/>
+          <w:numId w:val="4"/>
+        </w:numPr>
+      </w:pPr>
+      <w:r>
+        <w:t>The number that appears the least</w:t>
+      </w:r>
+    </w:p>
+    <w:p>
+      <w:pPr>
+        <w:pStyle w:val="ListParagraph"/>
+        <w:numPr>
+          <w:ilvl w:val="0"/>
+          <w:numId w:val="4"/>
+        </w:numPr>
+      </w:pPr>
+      <w:r>
+        <w:t xml:space="preserve">Range is the simplest measure of depression </w:t>
+      </w:r>
+    </w:p>
+    <w:p>
+      <w:pPr>
+        <w:pStyle w:val="ListParagraph"/>
+        <w:numPr>
+          <w:ilvl w:val="1"/>
+          <w:numId w:val="4"/>
         </w:numPr>
       </w:pPr>
       <w:r>
@@ -573,7 +929,7 @@
         <w:pStyle w:val="ListParagraph"/>
         <w:numPr>
           <w:ilvl w:val="1"/>
-          <w:numId w:val="1"/>
+          <w:numId w:val="4"/>
         </w:numPr>
       </w:pPr>
       <w:r>
@@ -581,16 +937,360 @@
       </w:r>
     </w:p>
     <w:p>
-      <w:r>
-        <w:t>Answer key for FIN-3210</w:t>
-      </w:r>
-    </w:p>
-    <w:p>
-      <w:pPr>
-        <w:pStyle w:val="ListParagraph"/>
-        <w:numPr>
-          <w:ilvl w:val="0"/>
-          <w:numId w:val="2"/>
+      <w:pPr>
+        <w:pStyle w:val="ListParagraph"/>
+        <w:numPr>
+          <w:ilvl w:val="0"/>
+          <w:numId w:val="4"/>
+        </w:numPr>
+      </w:pPr>
+      <w:r>
+        <w:t>What is the name of the symbol that represents sample mean</w:t>
+      </w:r>
+    </w:p>
+    <w:p>
+      <w:pPr>
+        <w:pStyle w:val="ListParagraph"/>
+        <w:numPr>
+          <w:ilvl w:val="1"/>
+          <w:numId w:val="4"/>
+        </w:numPr>
+      </w:pPr>
+      <w:r>
+        <w:t>X-bar</w:t>
+      </w:r>
+    </w:p>
+    <w:p>
+      <w:pPr>
+        <w:pStyle w:val="ListParagraph"/>
+        <w:numPr>
+          <w:ilvl w:val="1"/>
+          <w:numId w:val="4"/>
+        </w:numPr>
+      </w:pPr>
+      <w:r>
+        <w:t>Mu</w:t>
+      </w:r>
+    </w:p>
+    <w:p>
+      <w:pPr>
+        <w:pStyle w:val="ListParagraph"/>
+        <w:numPr>
+          <w:ilvl w:val="1"/>
+          <w:numId w:val="4"/>
+        </w:numPr>
+      </w:pPr>
+      <w:r>
+        <w:t>Alpha</w:t>
+      </w:r>
+    </w:p>
+    <w:p>
+      <w:pPr>
+        <w:pStyle w:val="ListParagraph"/>
+        <w:numPr>
+          <w:ilvl w:val="1"/>
+          <w:numId w:val="4"/>
+        </w:numPr>
+      </w:pPr>
+      <w:r>
+        <w:t>Lambda</w:t>
+      </w:r>
+    </w:p>
+    <w:p>
+      <w:pPr>
+        <w:pStyle w:val="ListParagraph"/>
+        <w:numPr>
+          <w:ilvl w:val="0"/>
+          <w:numId w:val="4"/>
+        </w:numPr>
+      </w:pPr>
+      <w:r>
+        <w:t>The Greek symbol alpha represents the probability of error or the significance level</w:t>
+      </w:r>
+    </w:p>
+    <w:p>
+      <w:pPr>
+        <w:pStyle w:val="ListParagraph"/>
+        <w:numPr>
+          <w:ilvl w:val="1"/>
+          <w:numId w:val="4"/>
+        </w:numPr>
+      </w:pPr>
+      <w:r>
+        <w:t>True</w:t>
+      </w:r>
+    </w:p>
+    <w:p>
+      <w:pPr>
+        <w:pStyle w:val="ListParagraph"/>
+        <w:numPr>
+          <w:ilvl w:val="1"/>
+          <w:numId w:val="4"/>
+        </w:numPr>
+      </w:pPr>
+      <w:r>
+        <w:t xml:space="preserve">False </w:t>
+      </w:r>
+    </w:p>
+    <w:p>
+      <w:pPr>
+        <w:pStyle w:val="ListParagraph"/>
+        <w:numPr>
+          <w:ilvl w:val="0"/>
+          <w:numId w:val="4"/>
+        </w:numPr>
+      </w:pPr>
+      <w:r>
+        <w:t xml:space="preserve">What formula is </w:t>
+      </w:r>
+      <w:proofErr w:type="gramStart"/>
+      <w:r>
+        <w:t>similar to</w:t>
+      </w:r>
+      <w:proofErr w:type="gramEnd"/>
+      <w:r>
+        <w:t xml:space="preserve"> the regression formula</w:t>
+      </w:r>
+    </w:p>
+    <w:p>
+      <w:pPr>
+        <w:pStyle w:val="ListParagraph"/>
+        <w:numPr>
+          <w:ilvl w:val="1"/>
+          <w:numId w:val="4"/>
+        </w:numPr>
+      </w:pPr>
+      <w:r>
+        <w:t>Y = mx-b</w:t>
+      </w:r>
+    </w:p>
+    <w:p>
+      <w:pPr>
+        <w:pStyle w:val="ListParagraph"/>
+        <w:numPr>
+          <w:ilvl w:val="1"/>
+          <w:numId w:val="4"/>
+        </w:numPr>
+      </w:pPr>
+      <w:r>
+        <w:t>mx = y</w:t>
+      </w:r>
+      <w:r>
+        <w:t xml:space="preserve"> </w:t>
+      </w:r>
+      <w:r>
+        <w:t>+</w:t>
+      </w:r>
+      <w:r>
+        <w:t xml:space="preserve"> </w:t>
+      </w:r>
+      <w:r>
+        <w:t>b</w:t>
+      </w:r>
+    </w:p>
+    <w:p>
+      <w:pPr>
+        <w:pStyle w:val="ListParagraph"/>
+        <w:numPr>
+          <w:ilvl w:val="1"/>
+          <w:numId w:val="4"/>
+        </w:numPr>
+      </w:pPr>
+      <w:r>
+        <w:t>B = y</w:t>
+      </w:r>
+      <w:r>
+        <w:t xml:space="preserve"> </w:t>
+      </w:r>
+      <w:r>
+        <w:t>+</w:t>
+      </w:r>
+      <w:r>
+        <w:t xml:space="preserve"> </w:t>
+      </w:r>
+      <w:r>
+        <w:t>mx</w:t>
+      </w:r>
+    </w:p>
+    <w:p>
+      <w:pPr>
+        <w:pStyle w:val="ListParagraph"/>
+        <w:numPr>
+          <w:ilvl w:val="1"/>
+          <w:numId w:val="4"/>
+        </w:numPr>
+      </w:pPr>
+      <w:r>
+        <w:t>y = mx +b</w:t>
+      </w:r>
+    </w:p>
+    <w:p>
+      <w:pPr>
+        <w:pStyle w:val="ListParagraph"/>
+        <w:numPr>
+          <w:ilvl w:val="0"/>
+          <w:numId w:val="4"/>
+        </w:numPr>
+      </w:pPr>
+      <w:r>
+        <w:t>What about Regression analysis is false</w:t>
+      </w:r>
+    </w:p>
+    <w:p>
+      <w:pPr>
+        <w:pStyle w:val="ListParagraph"/>
+        <w:numPr>
+          <w:ilvl w:val="1"/>
+          <w:numId w:val="4"/>
+        </w:numPr>
+      </w:pPr>
+      <w:r>
+        <w:t>Can have causality</w:t>
+      </w:r>
+    </w:p>
+    <w:p>
+      <w:pPr>
+        <w:pStyle w:val="ListParagraph"/>
+        <w:numPr>
+          <w:ilvl w:val="1"/>
+          <w:numId w:val="4"/>
+        </w:numPr>
+      </w:pPr>
+      <w:r>
+        <w:t>Can determine important values</w:t>
+      </w:r>
+    </w:p>
+    <w:p>
+      <w:pPr>
+        <w:pStyle w:val="ListParagraph"/>
+        <w:numPr>
+          <w:ilvl w:val="1"/>
+          <w:numId w:val="4"/>
+        </w:numPr>
+      </w:pPr>
+      <w:r>
+        <w:t>Can predict other values with given data</w:t>
+      </w:r>
+    </w:p>
+    <w:p>
+      <w:pPr>
+        <w:pStyle w:val="ListParagraph"/>
+        <w:numPr>
+          <w:ilvl w:val="1"/>
+          <w:numId w:val="4"/>
+        </w:numPr>
+      </w:pPr>
+      <w:r>
+        <w:t>Can determine relationship</w:t>
+      </w:r>
+    </w:p>
+    <w:p>
+      <w:pPr>
+        <w:pStyle w:val="ListParagraph"/>
+        <w:numPr>
+          <w:ilvl w:val="0"/>
+          <w:numId w:val="4"/>
+        </w:numPr>
+      </w:pPr>
+      <w:r>
+        <w:t>The letter n represents the sample size</w:t>
+      </w:r>
+    </w:p>
+    <w:p>
+      <w:pPr>
+        <w:pStyle w:val="ListParagraph"/>
+        <w:numPr>
+          <w:ilvl w:val="1"/>
+          <w:numId w:val="4"/>
+        </w:numPr>
+      </w:pPr>
+      <w:r>
+        <w:t>True</w:t>
+      </w:r>
+    </w:p>
+    <w:p>
+      <w:pPr>
+        <w:pStyle w:val="ListParagraph"/>
+        <w:numPr>
+          <w:ilvl w:val="1"/>
+          <w:numId w:val="4"/>
+        </w:numPr>
+      </w:pPr>
+      <w:r>
+        <w:t>False</w:t>
+      </w:r>
+    </w:p>
+    <w:p>
+      <w:pPr>
+        <w:pStyle w:val="ListParagraph"/>
+        <w:numPr>
+          <w:ilvl w:val="0"/>
+          <w:numId w:val="4"/>
+        </w:numPr>
+      </w:pPr>
+      <w:r>
+        <w:t>What IS true of a Bell Curve</w:t>
+      </w:r>
+    </w:p>
+    <w:p>
+      <w:pPr>
+        <w:pStyle w:val="ListParagraph"/>
+        <w:numPr>
+          <w:ilvl w:val="1"/>
+          <w:numId w:val="4"/>
+        </w:numPr>
+      </w:pPr>
+      <w:r>
+        <w:t xml:space="preserve">The curve is NOT symmetrical </w:t>
+      </w:r>
+    </w:p>
+    <w:p>
+      <w:pPr>
+        <w:pStyle w:val="ListParagraph"/>
+        <w:numPr>
+          <w:ilvl w:val="1"/>
+          <w:numId w:val="4"/>
+        </w:numPr>
+      </w:pPr>
+      <w:r>
+        <w:t>The mean, median, and mode are all the same</w:t>
+      </w:r>
+    </w:p>
+    <w:p>
+      <w:pPr>
+        <w:pStyle w:val="ListParagraph"/>
+        <w:numPr>
+          <w:ilvl w:val="1"/>
+          <w:numId w:val="4"/>
+        </w:numPr>
+      </w:pPr>
+      <w:r>
+        <w:t>The peak is at the edges</w:t>
+      </w:r>
+    </w:p>
+    <w:p>
+      <w:r>
+        <w:t>Answer key for DS-3620</w:t>
+      </w:r>
+    </w:p>
+    <w:p>
+      <w:pPr>
+        <w:pStyle w:val="ListParagraph"/>
+        <w:numPr>
+          <w:ilvl w:val="0"/>
+          <w:numId w:val="5"/>
+        </w:numPr>
+      </w:pPr>
+      <w:r>
+        <w:t>B</w:t>
+      </w:r>
+    </w:p>
+    <w:p>
+      <w:pPr>
+        <w:pStyle w:val="ListParagraph"/>
+        <w:numPr>
+          <w:ilvl w:val="0"/>
+          <w:numId w:val="5"/>
         </w:numPr>
       </w:pPr>
       <w:r>
@@ -602,7 +1302,7 @@
         <w:pStyle w:val="ListParagraph"/>
         <w:numPr>
           <w:ilvl w:val="0"/>
-          <w:numId w:val="2"/>
+          <w:numId w:val="5"/>
         </w:numPr>
       </w:pPr>
       <w:r>
@@ -614,10 +1314,47 @@
         <w:pStyle w:val="ListParagraph"/>
         <w:numPr>
           <w:ilvl w:val="0"/>
-          <w:numId w:val="2"/>
-        </w:numPr>
-      </w:pPr>
-      <w:r>
+          <w:numId w:val="5"/>
+        </w:numPr>
+      </w:pPr>
+      <w:r>
+        <w:t>A</w:t>
+      </w:r>
+    </w:p>
+    <w:p>
+      <w:pPr>
+        <w:pStyle w:val="ListParagraph"/>
+        <w:numPr>
+          <w:ilvl w:val="0"/>
+          <w:numId w:val="5"/>
+        </w:numPr>
+      </w:pPr>
+      <w:r>
+        <w:t>A</w:t>
+      </w:r>
+    </w:p>
+    <w:p>
+      <w:pPr>
+        <w:pStyle w:val="ListParagraph"/>
+        <w:numPr>
+          <w:ilvl w:val="0"/>
+          <w:numId w:val="5"/>
+        </w:numPr>
+      </w:pPr>
+      <w:r>
+        <w:t>A</w:t>
+      </w:r>
+    </w:p>
+    <w:p>
+      <w:pPr>
+        <w:pStyle w:val="ListParagraph"/>
+        <w:numPr>
+          <w:ilvl w:val="0"/>
+          <w:numId w:val="5"/>
+        </w:numPr>
+      </w:pPr>
+      <w:r>
+        <w:lastRenderedPageBreak/>
         <w:t>D</w:t>
       </w:r>
     </w:p>
@@ -626,7 +1363,7 @@
         <w:pStyle w:val="ListParagraph"/>
         <w:numPr>
           <w:ilvl w:val="0"/>
-          <w:numId w:val="2"/>
+          <w:numId w:val="5"/>
         </w:numPr>
       </w:pPr>
       <w:r>
@@ -638,7 +1375,7 @@
         <w:pStyle w:val="ListParagraph"/>
         <w:numPr>
           <w:ilvl w:val="0"/>
-          <w:numId w:val="2"/>
+          <w:numId w:val="5"/>
         </w:numPr>
       </w:pPr>
       <w:r>
@@ -650,626 +1387,6 @@
         <w:pStyle w:val="ListParagraph"/>
         <w:numPr>
           <w:ilvl w:val="0"/>
-          <w:numId w:val="2"/>
-        </w:numPr>
-      </w:pPr>
-      <w:r>
-        <w:t>A</w:t>
-      </w:r>
-    </w:p>
-    <w:p>
-      <w:pPr>
-        <w:pStyle w:val="ListParagraph"/>
-        <w:numPr>
-          <w:ilvl w:val="0"/>
-          <w:numId w:val="2"/>
-        </w:numPr>
-      </w:pPr>
-      <w:r>
-        <w:t>C</w:t>
-      </w:r>
-    </w:p>
-    <w:p>
-      <w:pPr>
-        <w:pStyle w:val="ListParagraph"/>
-        <w:numPr>
-          <w:ilvl w:val="0"/>
-          <w:numId w:val="2"/>
-        </w:numPr>
-      </w:pPr>
-      <w:r>
-        <w:t>D</w:t>
-      </w:r>
-    </w:p>
-    <w:p>
-      <w:pPr>
-        <w:pStyle w:val="ListParagraph"/>
-        <w:numPr>
-          <w:ilvl w:val="0"/>
-          <w:numId w:val="2"/>
-        </w:numPr>
-      </w:pPr>
-      <w:r>
-        <w:t>D</w:t>
-      </w:r>
-    </w:p>
-    <w:p>
-      <w:pPr>
-        <w:pStyle w:val="ListParagraph"/>
-        <w:numPr>
-          <w:ilvl w:val="0"/>
-          <w:numId w:val="2"/>
-        </w:numPr>
-      </w:pPr>
-      <w:r>
-        <w:t>A</w:t>
-      </w:r>
-    </w:p>
-    <w:p/>
-    <w:p>
-      <w:r>
-        <w:t>DS-3620</w:t>
-      </w:r>
-    </w:p>
-    <w:p>
-      <w:pPr>
-        <w:pStyle w:val="ListParagraph"/>
-        <w:numPr>
-          <w:ilvl w:val="0"/>
-          <w:numId w:val="4"/>
-        </w:numPr>
-      </w:pPr>
-      <w:r>
-        <w:t>What is difficult, if not impossible, to obtain</w:t>
-      </w:r>
-    </w:p>
-    <w:p>
-      <w:pPr>
-        <w:pStyle w:val="ListParagraph"/>
-        <w:numPr>
-          <w:ilvl w:val="1"/>
-          <w:numId w:val="4"/>
-        </w:numPr>
-      </w:pPr>
-      <w:r>
-        <w:t>Sample data</w:t>
-      </w:r>
-    </w:p>
-    <w:p>
-      <w:pPr>
-        <w:pStyle w:val="ListParagraph"/>
-        <w:numPr>
-          <w:ilvl w:val="1"/>
-          <w:numId w:val="4"/>
-        </w:numPr>
-      </w:pPr>
-      <w:r>
-        <w:t>Population data</w:t>
-      </w:r>
-    </w:p>
-    <w:p>
-      <w:pPr>
-        <w:pStyle w:val="ListParagraph"/>
-        <w:numPr>
-          <w:ilvl w:val="1"/>
-          <w:numId w:val="4"/>
-        </w:numPr>
-      </w:pPr>
-      <w:r>
-        <w:t>Big data</w:t>
-      </w:r>
-    </w:p>
-    <w:p>
-      <w:pPr>
-        <w:pStyle w:val="ListParagraph"/>
-        <w:numPr>
-          <w:ilvl w:val="1"/>
-          <w:numId w:val="4"/>
-        </w:numPr>
-      </w:pPr>
-      <w:r>
-        <w:t>Meta data</w:t>
-      </w:r>
-    </w:p>
-    <w:p>
-      <w:pPr>
-        <w:pStyle w:val="ListParagraph"/>
-        <w:numPr>
-          <w:ilvl w:val="0"/>
-          <w:numId w:val="4"/>
-        </w:numPr>
-      </w:pPr>
-      <w:r>
-        <w:t>What is time series data</w:t>
-      </w:r>
-    </w:p>
-    <w:p>
-      <w:pPr>
-        <w:pStyle w:val="ListParagraph"/>
-        <w:numPr>
-          <w:ilvl w:val="1"/>
-          <w:numId w:val="4"/>
-        </w:numPr>
-      </w:pPr>
-      <w:r>
-        <w:t>Records info in equal time periods</w:t>
-      </w:r>
-    </w:p>
-    <w:p>
-      <w:pPr>
-        <w:pStyle w:val="ListParagraph"/>
-        <w:numPr>
-          <w:ilvl w:val="1"/>
-          <w:numId w:val="4"/>
-        </w:numPr>
-      </w:pPr>
-      <w:r>
-        <w:t>Records info over time</w:t>
-      </w:r>
-    </w:p>
-    <w:p>
-      <w:pPr>
-        <w:pStyle w:val="ListParagraph"/>
-        <w:numPr>
-          <w:ilvl w:val="1"/>
-          <w:numId w:val="4"/>
-        </w:numPr>
-      </w:pPr>
-      <w:r>
-        <w:t>Records info from the past times</w:t>
-      </w:r>
-    </w:p>
-    <w:p>
-      <w:pPr>
-        <w:pStyle w:val="ListParagraph"/>
-        <w:numPr>
-          <w:ilvl w:val="1"/>
-          <w:numId w:val="4"/>
-        </w:numPr>
-      </w:pPr>
-      <w:r>
-        <w:t>Records info far into the future</w:t>
-      </w:r>
-    </w:p>
-    <w:p>
-      <w:pPr>
-        <w:pStyle w:val="ListParagraph"/>
-        <w:numPr>
-          <w:ilvl w:val="0"/>
-          <w:numId w:val="4"/>
-        </w:numPr>
-      </w:pPr>
-      <w:r>
-        <w:t>What is mode</w:t>
-      </w:r>
-    </w:p>
-    <w:p>
-      <w:pPr>
-        <w:pStyle w:val="ListParagraph"/>
-        <w:numPr>
-          <w:ilvl w:val="1"/>
-          <w:numId w:val="4"/>
-        </w:numPr>
-      </w:pPr>
-      <w:r>
-        <w:t>The center of data</w:t>
-      </w:r>
-    </w:p>
-    <w:p>
-      <w:pPr>
-        <w:pStyle w:val="ListParagraph"/>
-        <w:numPr>
-          <w:ilvl w:val="1"/>
-          <w:numId w:val="4"/>
-        </w:numPr>
-      </w:pPr>
-      <w:r>
-        <w:lastRenderedPageBreak/>
-        <w:t>The average of data</w:t>
-      </w:r>
-    </w:p>
-    <w:p>
-      <w:pPr>
-        <w:pStyle w:val="ListParagraph"/>
-        <w:numPr>
-          <w:ilvl w:val="1"/>
-          <w:numId w:val="4"/>
-        </w:numPr>
-      </w:pPr>
-      <w:r>
-        <w:t xml:space="preserve">The number that occurs the most frequently </w:t>
-      </w:r>
-    </w:p>
-    <w:p>
-      <w:pPr>
-        <w:pStyle w:val="ListParagraph"/>
-        <w:numPr>
-          <w:ilvl w:val="1"/>
-          <w:numId w:val="4"/>
-        </w:numPr>
-      </w:pPr>
-      <w:r>
-        <w:t>The number that appears the least</w:t>
-      </w:r>
-    </w:p>
-    <w:p>
-      <w:pPr>
-        <w:pStyle w:val="ListParagraph"/>
-        <w:numPr>
-          <w:ilvl w:val="0"/>
-          <w:numId w:val="4"/>
-        </w:numPr>
-      </w:pPr>
-      <w:r>
-        <w:t xml:space="preserve">Range is the simplest measure of depression </w:t>
-      </w:r>
-    </w:p>
-    <w:p>
-      <w:pPr>
-        <w:pStyle w:val="ListParagraph"/>
-        <w:numPr>
-          <w:ilvl w:val="1"/>
-          <w:numId w:val="4"/>
-        </w:numPr>
-      </w:pPr>
-      <w:r>
-        <w:t>True</w:t>
-      </w:r>
-    </w:p>
-    <w:p>
-      <w:pPr>
-        <w:pStyle w:val="ListParagraph"/>
-        <w:numPr>
-          <w:ilvl w:val="1"/>
-          <w:numId w:val="4"/>
-        </w:numPr>
-      </w:pPr>
-      <w:r>
-        <w:t>False</w:t>
-      </w:r>
-    </w:p>
-    <w:p>
-      <w:pPr>
-        <w:pStyle w:val="ListParagraph"/>
-        <w:numPr>
-          <w:ilvl w:val="0"/>
-          <w:numId w:val="4"/>
-        </w:numPr>
-      </w:pPr>
-      <w:r>
-        <w:t>What is the name of the symbol that represents sample mean</w:t>
-      </w:r>
-    </w:p>
-    <w:p>
-      <w:pPr>
-        <w:pStyle w:val="ListParagraph"/>
-        <w:numPr>
-          <w:ilvl w:val="1"/>
-          <w:numId w:val="4"/>
-        </w:numPr>
-      </w:pPr>
-      <w:r>
-        <w:t>X-bar</w:t>
-      </w:r>
-    </w:p>
-    <w:p>
-      <w:pPr>
-        <w:pStyle w:val="ListParagraph"/>
-        <w:numPr>
-          <w:ilvl w:val="1"/>
-          <w:numId w:val="4"/>
-        </w:numPr>
-      </w:pPr>
-      <w:r>
-        <w:t>Mu</w:t>
-      </w:r>
-    </w:p>
-    <w:p>
-      <w:pPr>
-        <w:pStyle w:val="ListParagraph"/>
-        <w:numPr>
-          <w:ilvl w:val="1"/>
-          <w:numId w:val="4"/>
-        </w:numPr>
-      </w:pPr>
-      <w:r>
-        <w:t>Alpha</w:t>
-      </w:r>
-    </w:p>
-    <w:p>
-      <w:pPr>
-        <w:pStyle w:val="ListParagraph"/>
-        <w:numPr>
-          <w:ilvl w:val="1"/>
-          <w:numId w:val="4"/>
-        </w:numPr>
-      </w:pPr>
-      <w:r>
-        <w:t>Lambda</w:t>
-      </w:r>
-    </w:p>
-    <w:p>
-      <w:pPr>
-        <w:pStyle w:val="ListParagraph"/>
-        <w:numPr>
-          <w:ilvl w:val="0"/>
-          <w:numId w:val="4"/>
-        </w:numPr>
-      </w:pPr>
-      <w:r>
-        <w:t>The Greek symbol alpha represents the probability of error or the significance level</w:t>
-      </w:r>
-    </w:p>
-    <w:p>
-      <w:pPr>
-        <w:pStyle w:val="ListParagraph"/>
-        <w:numPr>
-          <w:ilvl w:val="1"/>
-          <w:numId w:val="4"/>
-        </w:numPr>
-      </w:pPr>
-      <w:r>
-        <w:t>True</w:t>
-      </w:r>
-    </w:p>
-    <w:p>
-      <w:pPr>
-        <w:pStyle w:val="ListParagraph"/>
-        <w:numPr>
-          <w:ilvl w:val="1"/>
-          <w:numId w:val="4"/>
-        </w:numPr>
-      </w:pPr>
-      <w:r>
-        <w:t xml:space="preserve">False </w:t>
-      </w:r>
-    </w:p>
-    <w:p>
-      <w:pPr>
-        <w:pStyle w:val="ListParagraph"/>
-        <w:numPr>
-          <w:ilvl w:val="0"/>
-          <w:numId w:val="4"/>
-        </w:numPr>
-      </w:pPr>
-      <w:r>
-        <w:t xml:space="preserve">What formula is </w:t>
-      </w:r>
-      <w:proofErr w:type="gramStart"/>
-      <w:r>
-        <w:t>similar to</w:t>
-      </w:r>
-      <w:proofErr w:type="gramEnd"/>
-      <w:r>
-        <w:t xml:space="preserve"> the regression formula</w:t>
-      </w:r>
-    </w:p>
-    <w:p>
-      <w:pPr>
-        <w:pStyle w:val="ListParagraph"/>
-        <w:numPr>
-          <w:ilvl w:val="1"/>
-          <w:numId w:val="4"/>
-        </w:numPr>
-      </w:pPr>
-      <w:r>
-        <w:t>Y = mx-b</w:t>
-      </w:r>
-    </w:p>
-    <w:p>
-      <w:pPr>
-        <w:pStyle w:val="ListParagraph"/>
-        <w:numPr>
-          <w:ilvl w:val="1"/>
-          <w:numId w:val="4"/>
-        </w:numPr>
-      </w:pPr>
-      <w:r>
-        <w:t>mx = y</w:t>
-      </w:r>
-      <w:r>
-        <w:t xml:space="preserve"> </w:t>
-      </w:r>
-      <w:r>
-        <w:t>+</w:t>
-      </w:r>
-      <w:r>
-        <w:t xml:space="preserve"> </w:t>
-      </w:r>
-      <w:r>
-        <w:t>b</w:t>
-      </w:r>
-    </w:p>
-    <w:p>
-      <w:pPr>
-        <w:pStyle w:val="ListParagraph"/>
-        <w:numPr>
-          <w:ilvl w:val="1"/>
-          <w:numId w:val="4"/>
-        </w:numPr>
-      </w:pPr>
-      <w:r>
-        <w:t>B = y</w:t>
-      </w:r>
-      <w:r>
-        <w:t xml:space="preserve"> </w:t>
-      </w:r>
-      <w:r>
-        <w:t>+</w:t>
-      </w:r>
-      <w:r>
-        <w:t xml:space="preserve"> </w:t>
-      </w:r>
-      <w:r>
-        <w:t>mx</w:t>
-      </w:r>
-    </w:p>
-    <w:p>
-      <w:pPr>
-        <w:pStyle w:val="ListParagraph"/>
-        <w:numPr>
-          <w:ilvl w:val="1"/>
-          <w:numId w:val="4"/>
-        </w:numPr>
-      </w:pPr>
-      <w:r>
-        <w:t>y = mx +b</w:t>
-      </w:r>
-    </w:p>
-    <w:p>
-      <w:pPr>
-        <w:pStyle w:val="ListParagraph"/>
-        <w:numPr>
-          <w:ilvl w:val="0"/>
-          <w:numId w:val="4"/>
-        </w:numPr>
-      </w:pPr>
-      <w:r>
-        <w:t>What about Regression analysis is false</w:t>
-      </w:r>
-    </w:p>
-    <w:p>
-      <w:pPr>
-        <w:pStyle w:val="ListParagraph"/>
-        <w:numPr>
-          <w:ilvl w:val="1"/>
-          <w:numId w:val="4"/>
-        </w:numPr>
-      </w:pPr>
-      <w:r>
-        <w:t>Can have causality</w:t>
-      </w:r>
-    </w:p>
-    <w:p>
-      <w:pPr>
-        <w:pStyle w:val="ListParagraph"/>
-        <w:numPr>
-          <w:ilvl w:val="1"/>
-          <w:numId w:val="4"/>
-        </w:numPr>
-      </w:pPr>
-      <w:r>
-        <w:t>Can determine important values</w:t>
-      </w:r>
-    </w:p>
-    <w:p>
-      <w:pPr>
-        <w:pStyle w:val="ListParagraph"/>
-        <w:numPr>
-          <w:ilvl w:val="1"/>
-          <w:numId w:val="4"/>
-        </w:numPr>
-      </w:pPr>
-      <w:r>
-        <w:t>Can predict other values with given data</w:t>
-      </w:r>
-    </w:p>
-    <w:p>
-      <w:pPr>
-        <w:pStyle w:val="ListParagraph"/>
-        <w:numPr>
-          <w:ilvl w:val="1"/>
-          <w:numId w:val="4"/>
-        </w:numPr>
-      </w:pPr>
-      <w:r>
-        <w:t>Can determine relationship</w:t>
-      </w:r>
-    </w:p>
-    <w:p>
-      <w:pPr>
-        <w:pStyle w:val="ListParagraph"/>
-        <w:numPr>
-          <w:ilvl w:val="0"/>
-          <w:numId w:val="4"/>
-        </w:numPr>
-      </w:pPr>
-      <w:r>
-        <w:t>The letter n represents the sample size</w:t>
-      </w:r>
-    </w:p>
-    <w:p>
-      <w:pPr>
-        <w:pStyle w:val="ListParagraph"/>
-        <w:numPr>
-          <w:ilvl w:val="1"/>
-          <w:numId w:val="4"/>
-        </w:numPr>
-      </w:pPr>
-      <w:r>
-        <w:t>True</w:t>
-      </w:r>
-    </w:p>
-    <w:p>
-      <w:pPr>
-        <w:pStyle w:val="ListParagraph"/>
-        <w:numPr>
-          <w:ilvl w:val="1"/>
-          <w:numId w:val="4"/>
-        </w:numPr>
-      </w:pPr>
-      <w:r>
-        <w:t>False</w:t>
-      </w:r>
-    </w:p>
-    <w:p>
-      <w:pPr>
-        <w:pStyle w:val="ListParagraph"/>
-        <w:numPr>
-          <w:ilvl w:val="0"/>
-          <w:numId w:val="4"/>
-        </w:numPr>
-      </w:pPr>
-      <w:r>
-        <w:t>What IS true of a Bell Curve</w:t>
-      </w:r>
-    </w:p>
-    <w:p>
-      <w:pPr>
-        <w:pStyle w:val="ListParagraph"/>
-        <w:numPr>
-          <w:ilvl w:val="1"/>
-          <w:numId w:val="4"/>
-        </w:numPr>
-      </w:pPr>
-      <w:r>
-        <w:t xml:space="preserve">The curve is NOT symmetrical </w:t>
-      </w:r>
-    </w:p>
-    <w:p>
-      <w:pPr>
-        <w:pStyle w:val="ListParagraph"/>
-        <w:numPr>
-          <w:ilvl w:val="1"/>
-          <w:numId w:val="4"/>
-        </w:numPr>
-      </w:pPr>
-      <w:r>
-        <w:t>The mean, median, and mode are all the same</w:t>
-      </w:r>
-    </w:p>
-    <w:p>
-      <w:pPr>
-        <w:pStyle w:val="ListParagraph"/>
-        <w:numPr>
-          <w:ilvl w:val="1"/>
-          <w:numId w:val="4"/>
-        </w:numPr>
-      </w:pPr>
-      <w:r>
-        <w:t>The peak is at the edges</w:t>
-      </w:r>
-    </w:p>
-    <w:p>
-      <w:r>
-        <w:t>Answer key for DS-3620</w:t>
-      </w:r>
-    </w:p>
-    <w:p>
-      <w:pPr>
-        <w:pStyle w:val="ListParagraph"/>
-        <w:numPr>
-          <w:ilvl w:val="0"/>
           <w:numId w:val="5"/>
         </w:numPr>
       </w:pPr>
@@ -1279,120 +1396,11 @@
     </w:p>
     <w:p>
       <w:pPr>
-        <w:pStyle w:val="ListParagraph"/>
-        <w:numPr>
-          <w:ilvl w:val="0"/>
-          <w:numId w:val="5"/>
-        </w:numPr>
-      </w:pPr>
-      <w:r>
-        <w:t>A</w:t>
-      </w:r>
-    </w:p>
-    <w:p>
-      <w:pPr>
-        <w:pStyle w:val="ListParagraph"/>
-        <w:numPr>
-          <w:ilvl w:val="0"/>
-          <w:numId w:val="5"/>
-        </w:numPr>
-      </w:pPr>
-      <w:r>
-        <w:t>C</w:t>
-      </w:r>
-    </w:p>
-    <w:p>
-      <w:pPr>
-        <w:pStyle w:val="ListParagraph"/>
-        <w:numPr>
-          <w:ilvl w:val="0"/>
-          <w:numId w:val="5"/>
-        </w:numPr>
-      </w:pPr>
-      <w:r>
-        <w:t>A</w:t>
-      </w:r>
-    </w:p>
-    <w:p>
-      <w:pPr>
-        <w:pStyle w:val="ListParagraph"/>
-        <w:numPr>
-          <w:ilvl w:val="0"/>
-          <w:numId w:val="5"/>
-        </w:numPr>
-      </w:pPr>
-      <w:r>
-        <w:t>A</w:t>
-      </w:r>
-    </w:p>
-    <w:p>
-      <w:pPr>
-        <w:pStyle w:val="ListParagraph"/>
-        <w:numPr>
-          <w:ilvl w:val="0"/>
-          <w:numId w:val="5"/>
-        </w:numPr>
-      </w:pPr>
-      <w:r>
-        <w:t>A</w:t>
-      </w:r>
-    </w:p>
-    <w:p>
-      <w:pPr>
-        <w:pStyle w:val="ListParagraph"/>
-        <w:numPr>
-          <w:ilvl w:val="0"/>
-          <w:numId w:val="5"/>
-        </w:numPr>
-      </w:pPr>
-      <w:r>
-        <w:t>D</w:t>
-      </w:r>
-    </w:p>
-    <w:p>
-      <w:pPr>
-        <w:pStyle w:val="ListParagraph"/>
-        <w:numPr>
-          <w:ilvl w:val="0"/>
-          <w:numId w:val="5"/>
-        </w:numPr>
-      </w:pPr>
-      <w:r>
-        <w:t>A</w:t>
-      </w:r>
-    </w:p>
-    <w:p>
-      <w:pPr>
-        <w:pStyle w:val="ListParagraph"/>
-        <w:numPr>
-          <w:ilvl w:val="0"/>
-          <w:numId w:val="5"/>
-        </w:numPr>
-      </w:pPr>
-      <w:r>
-        <w:t>A</w:t>
-      </w:r>
-    </w:p>
-    <w:p>
-      <w:pPr>
-        <w:pStyle w:val="ListParagraph"/>
-        <w:numPr>
-          <w:ilvl w:val="0"/>
-          <w:numId w:val="5"/>
-        </w:numPr>
-      </w:pPr>
-      <w:r>
-        <w:t>B</w:t>
-      </w:r>
-    </w:p>
-    <w:p>
-      <w:pPr>
         <w:ind w:left="360"/>
       </w:pPr>
     </w:p>
     <w:p>
       <w:r>
-        <w:lastRenderedPageBreak/>
         <w:br/>
         <w:t>DS-38</w:t>
       </w:r>
@@ -1917,6 +1925,7 @@
         </w:numPr>
       </w:pPr>
       <w:r>
+        <w:lastRenderedPageBreak/>
         <w:t>+,-,&amp;,^</w:t>
       </w:r>
     </w:p>
@@ -2391,6 +2400,7 @@
         </w:numPr>
       </w:pPr>
       <w:r>
+        <w:lastRenderedPageBreak/>
         <w:t>An act made to warn employees of potential hiring opportunities</w:t>
       </w:r>
     </w:p>
@@ -2466,335 +2476,395 @@
         </w:numPr>
       </w:pPr>
       <w:r>
+        <w:t>Executive employees</w:t>
+      </w:r>
+    </w:p>
+    <w:p>
+      <w:pPr>
+        <w:pStyle w:val="ListParagraph"/>
+        <w:numPr>
+          <w:ilvl w:val="1"/>
+          <w:numId w:val="8"/>
+        </w:numPr>
+      </w:pPr>
+      <w:r>
+        <w:t>At will employees</w:t>
+      </w:r>
+    </w:p>
+    <w:p>
+      <w:pPr>
+        <w:pStyle w:val="ListParagraph"/>
+        <w:numPr>
+          <w:ilvl w:val="1"/>
+          <w:numId w:val="8"/>
+        </w:numPr>
+      </w:pPr>
+      <w:r>
+        <w:t>Immune employees</w:t>
+      </w:r>
+    </w:p>
+    <w:p>
+      <w:pPr>
+        <w:pStyle w:val="ListParagraph"/>
+        <w:numPr>
+          <w:ilvl w:val="0"/>
+          <w:numId w:val="8"/>
+        </w:numPr>
+      </w:pPr>
+      <w:r>
+        <w:t>Ethics have to do with all of these except what</w:t>
+      </w:r>
+    </w:p>
+    <w:p>
+      <w:pPr>
+        <w:pStyle w:val="ListParagraph"/>
+        <w:numPr>
+          <w:ilvl w:val="1"/>
+          <w:numId w:val="8"/>
+        </w:numPr>
+      </w:pPr>
+      <w:r>
+        <w:t>Fairness</w:t>
+      </w:r>
+    </w:p>
+    <w:p>
+      <w:pPr>
+        <w:pStyle w:val="ListParagraph"/>
+        <w:numPr>
+          <w:ilvl w:val="1"/>
+          <w:numId w:val="8"/>
+        </w:numPr>
+      </w:pPr>
+      <w:r>
+        <w:t>Justness</w:t>
+      </w:r>
+    </w:p>
+    <w:p>
+      <w:pPr>
+        <w:pStyle w:val="ListParagraph"/>
+        <w:numPr>
+          <w:ilvl w:val="1"/>
+          <w:numId w:val="8"/>
+        </w:numPr>
+      </w:pPr>
+      <w:r>
+        <w:t>Rightness</w:t>
+      </w:r>
+    </w:p>
+    <w:p>
+      <w:pPr>
+        <w:pStyle w:val="ListParagraph"/>
+        <w:numPr>
+          <w:ilvl w:val="1"/>
+          <w:numId w:val="8"/>
+        </w:numPr>
+      </w:pPr>
+      <w:r>
+        <w:t>Lawfulness</w:t>
+      </w:r>
+    </w:p>
+    <w:p>
+      <w:pPr>
+        <w:pStyle w:val="ListParagraph"/>
+        <w:numPr>
+          <w:ilvl w:val="0"/>
+          <w:numId w:val="8"/>
+        </w:numPr>
+      </w:pPr>
+      <w:r>
+        <w:t>What does IDDR stand for</w:t>
+      </w:r>
+    </w:p>
+    <w:p>
+      <w:pPr>
+        <w:pStyle w:val="ListParagraph"/>
+        <w:numPr>
+          <w:ilvl w:val="1"/>
+          <w:numId w:val="8"/>
+        </w:numPr>
+      </w:pPr>
+      <w:r>
+        <w:t>I Desire to Do Right</w:t>
+      </w:r>
+    </w:p>
+    <w:p>
+      <w:pPr>
+        <w:pStyle w:val="ListParagraph"/>
+        <w:numPr>
+          <w:ilvl w:val="1"/>
+          <w:numId w:val="8"/>
+        </w:numPr>
+      </w:pPr>
+      <w:r>
+        <w:t>I Demand to Deny Rights</w:t>
+      </w:r>
+    </w:p>
+    <w:p>
+      <w:pPr>
+        <w:pStyle w:val="ListParagraph"/>
+        <w:numPr>
+          <w:ilvl w:val="1"/>
+          <w:numId w:val="8"/>
+        </w:numPr>
+      </w:pPr>
+      <w:r>
+        <w:t>Interdimensional</w:t>
+      </w:r>
+      <w:r>
+        <w:t xml:space="preserve"> dynamic response</w:t>
+      </w:r>
+    </w:p>
+    <w:p>
+      <w:pPr>
+        <w:pStyle w:val="ListParagraph"/>
+        <w:numPr>
+          <w:ilvl w:val="1"/>
+          <w:numId w:val="8"/>
+        </w:numPr>
+      </w:pPr>
+      <w:r>
+        <w:t>I desire for doomed rides</w:t>
+      </w:r>
+    </w:p>
+    <w:p>
+      <w:pPr>
+        <w:pStyle w:val="ListParagraph"/>
+        <w:numPr>
+          <w:ilvl w:val="0"/>
+          <w:numId w:val="8"/>
+        </w:numPr>
+      </w:pPr>
+      <w:r>
+        <w:t xml:space="preserve">Employers cannot be successfully sued for harassment in the workplace if proper action is taken </w:t>
+      </w:r>
+    </w:p>
+    <w:p>
+      <w:pPr>
+        <w:pStyle w:val="ListParagraph"/>
+        <w:numPr>
+          <w:ilvl w:val="1"/>
+          <w:numId w:val="8"/>
+        </w:numPr>
+      </w:pPr>
+      <w:r>
+        <w:t>True</w:t>
+      </w:r>
+    </w:p>
+    <w:p>
+      <w:pPr>
+        <w:pStyle w:val="ListParagraph"/>
+        <w:numPr>
+          <w:ilvl w:val="1"/>
+          <w:numId w:val="8"/>
+        </w:numPr>
+      </w:pPr>
+      <w:r>
+        <w:t>False</w:t>
+      </w:r>
+    </w:p>
+    <w:p/>
+    <w:p>
+      <w:r>
+        <w:t>Answer key for LAW-2810</w:t>
+      </w:r>
+    </w:p>
+    <w:p>
+      <w:pPr>
+        <w:pStyle w:val="ListParagraph"/>
+        <w:numPr>
+          <w:ilvl w:val="0"/>
+          <w:numId w:val="9"/>
+        </w:numPr>
+      </w:pPr>
+      <w:r>
+        <w:t>B</w:t>
+      </w:r>
+    </w:p>
+    <w:p>
+      <w:pPr>
+        <w:pStyle w:val="ListParagraph"/>
+        <w:numPr>
+          <w:ilvl w:val="0"/>
+          <w:numId w:val="9"/>
+        </w:numPr>
+      </w:pPr>
+      <w:r>
+        <w:t>D</w:t>
+      </w:r>
+    </w:p>
+    <w:p>
+      <w:pPr>
+        <w:pStyle w:val="ListParagraph"/>
+        <w:numPr>
+          <w:ilvl w:val="0"/>
+          <w:numId w:val="9"/>
+        </w:numPr>
+      </w:pPr>
+      <w:r>
+        <w:t>D</w:t>
+      </w:r>
+    </w:p>
+    <w:p>
+      <w:pPr>
+        <w:pStyle w:val="ListParagraph"/>
+        <w:numPr>
+          <w:ilvl w:val="0"/>
+          <w:numId w:val="9"/>
+        </w:numPr>
+      </w:pPr>
+      <w:r>
+        <w:t>A</w:t>
+      </w:r>
+    </w:p>
+    <w:p>
+      <w:pPr>
+        <w:pStyle w:val="ListParagraph"/>
+        <w:numPr>
+          <w:ilvl w:val="0"/>
+          <w:numId w:val="9"/>
+        </w:numPr>
+      </w:pPr>
+      <w:r>
+        <w:t>A</w:t>
+      </w:r>
+    </w:p>
+    <w:p>
+      <w:pPr>
+        <w:pStyle w:val="ListParagraph"/>
+        <w:numPr>
+          <w:ilvl w:val="0"/>
+          <w:numId w:val="9"/>
+        </w:numPr>
+      </w:pPr>
+      <w:r>
+        <w:t>B</w:t>
+      </w:r>
+    </w:p>
+    <w:p>
+      <w:pPr>
+        <w:pStyle w:val="ListParagraph"/>
+        <w:numPr>
+          <w:ilvl w:val="0"/>
+          <w:numId w:val="9"/>
+        </w:numPr>
+      </w:pPr>
+      <w:r>
+        <w:t>C</w:t>
+      </w:r>
+    </w:p>
+    <w:p>
+      <w:pPr>
+        <w:pStyle w:val="ListParagraph"/>
+        <w:numPr>
+          <w:ilvl w:val="0"/>
+          <w:numId w:val="9"/>
+        </w:numPr>
+      </w:pPr>
+      <w:r>
+        <w:t>D</w:t>
+      </w:r>
+    </w:p>
+    <w:p>
+      <w:pPr>
+        <w:pStyle w:val="ListParagraph"/>
+        <w:numPr>
+          <w:ilvl w:val="0"/>
+          <w:numId w:val="9"/>
+        </w:numPr>
+      </w:pPr>
+      <w:r>
+        <w:t>A</w:t>
+      </w:r>
+    </w:p>
+    <w:p>
+      <w:pPr>
+        <w:pStyle w:val="ListParagraph"/>
+        <w:numPr>
+          <w:ilvl w:val="0"/>
+          <w:numId w:val="9"/>
+        </w:numPr>
+      </w:pPr>
+      <w:r>
+        <w:t>A</w:t>
+      </w:r>
+    </w:p>
+    <w:p/>
+    <w:p>
+      <w:r>
+        <w:t>DS-3860</w:t>
+      </w:r>
+    </w:p>
+    <w:p>
+      <w:pPr>
+        <w:pStyle w:val="ListParagraph"/>
+        <w:numPr>
+          <w:ilvl w:val="0"/>
+          <w:numId w:val="10"/>
+        </w:numPr>
+      </w:pPr>
+      <w:r>
+        <w:t>The term NOSQL means that SQL will not be used in the database</w:t>
+      </w:r>
+    </w:p>
+    <w:p>
+      <w:pPr>
+        <w:pStyle w:val="ListParagraph"/>
+        <w:numPr>
+          <w:ilvl w:val="1"/>
+          <w:numId w:val="10"/>
+        </w:numPr>
+      </w:pPr>
+      <w:r>
+        <w:t xml:space="preserve">True </w:t>
+      </w:r>
+    </w:p>
+    <w:p>
+      <w:pPr>
+        <w:pStyle w:val="ListParagraph"/>
+        <w:numPr>
+          <w:ilvl w:val="1"/>
+          <w:numId w:val="10"/>
+        </w:numPr>
+      </w:pPr>
+      <w:r>
+        <w:t>False</w:t>
+      </w:r>
+    </w:p>
+    <w:p>
+      <w:pPr>
+        <w:pStyle w:val="ListParagraph"/>
+        <w:numPr>
+          <w:ilvl w:val="0"/>
+          <w:numId w:val="10"/>
+        </w:numPr>
+      </w:pPr>
+      <w:r>
+        <w:t>ACID compliance includes all the following except</w:t>
+      </w:r>
+    </w:p>
+    <w:p>
+      <w:pPr>
+        <w:pStyle w:val="ListParagraph"/>
+        <w:numPr>
+          <w:ilvl w:val="1"/>
+          <w:numId w:val="10"/>
+        </w:numPr>
+      </w:pPr>
+      <w:r>
         <w:lastRenderedPageBreak/>
-        <w:t>Executive employees</w:t>
-      </w:r>
-    </w:p>
-    <w:p>
-      <w:pPr>
-        <w:pStyle w:val="ListParagraph"/>
-        <w:numPr>
-          <w:ilvl w:val="1"/>
-          <w:numId w:val="8"/>
-        </w:numPr>
-      </w:pPr>
-      <w:r>
-        <w:t>At will employees</w:t>
-      </w:r>
-    </w:p>
-    <w:p>
-      <w:pPr>
-        <w:pStyle w:val="ListParagraph"/>
-        <w:numPr>
-          <w:ilvl w:val="1"/>
-          <w:numId w:val="8"/>
-        </w:numPr>
-      </w:pPr>
-      <w:r>
-        <w:t>Immune employees</w:t>
-      </w:r>
-    </w:p>
-    <w:p>
-      <w:pPr>
-        <w:pStyle w:val="ListParagraph"/>
-        <w:numPr>
-          <w:ilvl w:val="0"/>
-          <w:numId w:val="8"/>
-        </w:numPr>
-      </w:pPr>
-      <w:r>
-        <w:t>Ethics have to do with all of these except what</w:t>
-      </w:r>
-    </w:p>
-    <w:p>
-      <w:pPr>
-        <w:pStyle w:val="ListParagraph"/>
-        <w:numPr>
-          <w:ilvl w:val="1"/>
-          <w:numId w:val="8"/>
-        </w:numPr>
-      </w:pPr>
-      <w:r>
-        <w:t>Fairness</w:t>
-      </w:r>
-    </w:p>
-    <w:p>
-      <w:pPr>
-        <w:pStyle w:val="ListParagraph"/>
-        <w:numPr>
-          <w:ilvl w:val="1"/>
-          <w:numId w:val="8"/>
-        </w:numPr>
-      </w:pPr>
-      <w:r>
-        <w:t>Justness</w:t>
-      </w:r>
-    </w:p>
-    <w:p>
-      <w:pPr>
-        <w:pStyle w:val="ListParagraph"/>
-        <w:numPr>
-          <w:ilvl w:val="1"/>
-          <w:numId w:val="8"/>
-        </w:numPr>
-      </w:pPr>
-      <w:r>
-        <w:t>Rightness</w:t>
-      </w:r>
-    </w:p>
-    <w:p>
-      <w:pPr>
-        <w:pStyle w:val="ListParagraph"/>
-        <w:numPr>
-          <w:ilvl w:val="1"/>
-          <w:numId w:val="8"/>
-        </w:numPr>
-      </w:pPr>
-      <w:r>
-        <w:t>Lawfulness</w:t>
-      </w:r>
-    </w:p>
-    <w:p>
-      <w:pPr>
-        <w:pStyle w:val="ListParagraph"/>
-        <w:numPr>
-          <w:ilvl w:val="0"/>
-          <w:numId w:val="8"/>
-        </w:numPr>
-      </w:pPr>
-      <w:r>
-        <w:t>What does IDDR stand for</w:t>
-      </w:r>
-    </w:p>
-    <w:p>
-      <w:pPr>
-        <w:pStyle w:val="ListParagraph"/>
-        <w:numPr>
-          <w:ilvl w:val="1"/>
-          <w:numId w:val="8"/>
-        </w:numPr>
-      </w:pPr>
-      <w:r>
-        <w:t>I Desire to Do Right</w:t>
-      </w:r>
-    </w:p>
-    <w:p>
-      <w:pPr>
-        <w:pStyle w:val="ListParagraph"/>
-        <w:numPr>
-          <w:ilvl w:val="1"/>
-          <w:numId w:val="8"/>
-        </w:numPr>
-      </w:pPr>
-      <w:r>
-        <w:t>I Demand to Deny Rights</w:t>
-      </w:r>
-    </w:p>
-    <w:p>
-      <w:pPr>
-        <w:pStyle w:val="ListParagraph"/>
-        <w:numPr>
-          <w:ilvl w:val="1"/>
-          <w:numId w:val="8"/>
-        </w:numPr>
-      </w:pPr>
-      <w:r>
-        <w:t>Interdimensional</w:t>
-      </w:r>
-      <w:r>
-        <w:t xml:space="preserve"> dynamic response</w:t>
-      </w:r>
-    </w:p>
-    <w:p>
-      <w:pPr>
-        <w:pStyle w:val="ListParagraph"/>
-        <w:numPr>
-          <w:ilvl w:val="1"/>
-          <w:numId w:val="8"/>
-        </w:numPr>
-      </w:pPr>
-      <w:r>
-        <w:t>I desire for doomed rides</w:t>
-      </w:r>
-    </w:p>
-    <w:p>
-      <w:pPr>
-        <w:pStyle w:val="ListParagraph"/>
-        <w:numPr>
-          <w:ilvl w:val="0"/>
-          <w:numId w:val="8"/>
-        </w:numPr>
-      </w:pPr>
-      <w:r>
-        <w:t xml:space="preserve">Employers cannot be successfully sued for harassment in the workplace if proper action is taken </w:t>
-      </w:r>
-    </w:p>
-    <w:p>
-      <w:pPr>
-        <w:pStyle w:val="ListParagraph"/>
-        <w:numPr>
-          <w:ilvl w:val="1"/>
-          <w:numId w:val="8"/>
-        </w:numPr>
-      </w:pPr>
-      <w:r>
-        <w:t>True</w:t>
-      </w:r>
-    </w:p>
-    <w:p>
-      <w:pPr>
-        <w:pStyle w:val="ListParagraph"/>
-        <w:numPr>
-          <w:ilvl w:val="1"/>
-          <w:numId w:val="8"/>
-        </w:numPr>
-      </w:pPr>
-      <w:r>
-        <w:t>False</w:t>
-      </w:r>
-    </w:p>
-    <w:p/>
-    <w:p>
-      <w:r>
-        <w:t>Answer key for LAW-2810</w:t>
-      </w:r>
-    </w:p>
-    <w:p>
-      <w:pPr>
-        <w:pStyle w:val="ListParagraph"/>
-        <w:numPr>
-          <w:ilvl w:val="0"/>
-          <w:numId w:val="9"/>
-        </w:numPr>
-      </w:pPr>
-      <w:r>
-        <w:t>B</w:t>
-      </w:r>
-    </w:p>
-    <w:p>
-      <w:pPr>
-        <w:pStyle w:val="ListParagraph"/>
-        <w:numPr>
-          <w:ilvl w:val="0"/>
-          <w:numId w:val="9"/>
-        </w:numPr>
-      </w:pPr>
-      <w:r>
-        <w:t>D</w:t>
-      </w:r>
-    </w:p>
-    <w:p>
-      <w:pPr>
-        <w:pStyle w:val="ListParagraph"/>
-        <w:numPr>
-          <w:ilvl w:val="0"/>
-          <w:numId w:val="9"/>
-        </w:numPr>
-      </w:pPr>
-      <w:r>
-        <w:t>D</w:t>
-      </w:r>
-    </w:p>
-    <w:p>
-      <w:pPr>
-        <w:pStyle w:val="ListParagraph"/>
-        <w:numPr>
-          <w:ilvl w:val="0"/>
-          <w:numId w:val="9"/>
-        </w:numPr>
-      </w:pPr>
-      <w:r>
-        <w:t>A</w:t>
-      </w:r>
-    </w:p>
-    <w:p>
-      <w:pPr>
-        <w:pStyle w:val="ListParagraph"/>
-        <w:numPr>
-          <w:ilvl w:val="0"/>
-          <w:numId w:val="9"/>
-        </w:numPr>
-      </w:pPr>
-      <w:r>
-        <w:t>A</w:t>
-      </w:r>
-    </w:p>
-    <w:p>
-      <w:pPr>
-        <w:pStyle w:val="ListParagraph"/>
-        <w:numPr>
-          <w:ilvl w:val="0"/>
-          <w:numId w:val="9"/>
-        </w:numPr>
-      </w:pPr>
-      <w:r>
-        <w:t>B</w:t>
-      </w:r>
-    </w:p>
-    <w:p>
-      <w:pPr>
-        <w:pStyle w:val="ListParagraph"/>
-        <w:numPr>
-          <w:ilvl w:val="0"/>
-          <w:numId w:val="9"/>
-        </w:numPr>
-      </w:pPr>
-      <w:r>
-        <w:t>C</w:t>
-      </w:r>
-    </w:p>
-    <w:p>
-      <w:pPr>
-        <w:pStyle w:val="ListParagraph"/>
-        <w:numPr>
-          <w:ilvl w:val="0"/>
-          <w:numId w:val="9"/>
-        </w:numPr>
-      </w:pPr>
-      <w:r>
-        <w:t>D</w:t>
-      </w:r>
-    </w:p>
-    <w:p>
-      <w:pPr>
-        <w:pStyle w:val="ListParagraph"/>
-        <w:numPr>
-          <w:ilvl w:val="0"/>
-          <w:numId w:val="9"/>
-        </w:numPr>
-      </w:pPr>
-      <w:r>
-        <w:t>A</w:t>
-      </w:r>
-    </w:p>
-    <w:p>
-      <w:pPr>
-        <w:pStyle w:val="ListParagraph"/>
-        <w:numPr>
-          <w:ilvl w:val="0"/>
-          <w:numId w:val="9"/>
-        </w:numPr>
-      </w:pPr>
-      <w:r>
-        <w:t>A</w:t>
-      </w:r>
-    </w:p>
-    <w:p/>
-    <w:p>
-      <w:r>
-        <w:t>DS-3860</w:t>
-      </w:r>
-    </w:p>
-    <w:p>
-      <w:pPr>
-        <w:pStyle w:val="ListParagraph"/>
-        <w:numPr>
-          <w:ilvl w:val="0"/>
+        <w:t>Atomicity</w:t>
+      </w:r>
+    </w:p>
+    <w:p>
+      <w:pPr>
+        <w:pStyle w:val="ListParagraph"/>
+        <w:numPr>
+          <w:ilvl w:val="1"/>
           <w:numId w:val="10"/>
         </w:numPr>
       </w:pPr>
       <w:r>
-        <w:t>The term NOSQL means that SQL will not be used in the database</w:t>
+        <w:t>Consistency</w:t>
       </w:r>
     </w:p>
     <w:p>
@@ -2806,7 +2876,7 @@
         </w:numPr>
       </w:pPr>
       <w:r>
-        <w:t xml:space="preserve">True </w:t>
+        <w:t>Isolation</w:t>
       </w:r>
     </w:p>
     <w:p>
@@ -2818,7 +2888,7 @@
         </w:numPr>
       </w:pPr>
       <w:r>
-        <w:t>False</w:t>
+        <w:t>Density</w:t>
       </w:r>
     </w:p>
     <w:p>
@@ -2830,7 +2900,7 @@
         </w:numPr>
       </w:pPr>
       <w:r>
-        <w:t>ACID compliance includes all the following except</w:t>
+        <w:t>Which of the following are valid cardinality examples</w:t>
       </w:r>
     </w:p>
     <w:p>
@@ -2842,7 +2912,7 @@
         </w:numPr>
       </w:pPr>
       <w:r>
-        <w:t>Atomicity</w:t>
+        <w:t>Many:2</w:t>
       </w:r>
     </w:p>
     <w:p>
@@ -2854,67 +2924,6 @@
         </w:numPr>
       </w:pPr>
       <w:r>
-        <w:t>Consistency</w:t>
-      </w:r>
-    </w:p>
-    <w:p>
-      <w:pPr>
-        <w:pStyle w:val="ListParagraph"/>
-        <w:numPr>
-          <w:ilvl w:val="1"/>
-          <w:numId w:val="10"/>
-        </w:numPr>
-      </w:pPr>
-      <w:r>
-        <w:t>Isolation</w:t>
-      </w:r>
-    </w:p>
-    <w:p>
-      <w:pPr>
-        <w:pStyle w:val="ListParagraph"/>
-        <w:numPr>
-          <w:ilvl w:val="1"/>
-          <w:numId w:val="10"/>
-        </w:numPr>
-      </w:pPr>
-      <w:r>
-        <w:t>Density</w:t>
-      </w:r>
-    </w:p>
-    <w:p>
-      <w:pPr>
-        <w:pStyle w:val="ListParagraph"/>
-        <w:numPr>
-          <w:ilvl w:val="0"/>
-          <w:numId w:val="10"/>
-        </w:numPr>
-      </w:pPr>
-      <w:r>
-        <w:t>Which of the following are valid cardinality examples</w:t>
-      </w:r>
-    </w:p>
-    <w:p>
-      <w:pPr>
-        <w:pStyle w:val="ListParagraph"/>
-        <w:numPr>
-          <w:ilvl w:val="1"/>
-          <w:numId w:val="10"/>
-        </w:numPr>
-      </w:pPr>
-      <w:r>
-        <w:t>Many:2</w:t>
-      </w:r>
-    </w:p>
-    <w:p>
-      <w:pPr>
-        <w:pStyle w:val="ListParagraph"/>
-        <w:numPr>
-          <w:ilvl w:val="1"/>
-          <w:numId w:val="10"/>
-        </w:numPr>
-      </w:pPr>
-      <w:r>
-        <w:lastRenderedPageBreak/>
         <w:t>1:1</w:t>
       </w:r>
     </w:p>
@@ -3365,6 +3374,7 @@
         </w:numPr>
       </w:pPr>
       <w:r>
+        <w:lastRenderedPageBreak/>
         <w:t>B</w:t>
       </w:r>
     </w:p>
@@ -3437,7 +3447,6 @@
         </w:numPr>
       </w:pPr>
       <w:r>
-        <w:lastRenderedPageBreak/>
         <w:t>D</w:t>
       </w:r>
     </w:p>

</xml_diff>